<commit_message>
docs: regenere le Word du dictionnaire CIBLE (couche acquisition/marketing, 10 entites)
</commit_message>
<xml_diff>
--- a/J1/02-Dictionnaire-de-variables.docx
+++ b/J1/02-Dictionnaire-de-variables.docx
@@ -31,7 +31,7 @@
           <w:color w:val="6B7380"/>
           <w:sz w:val="22"/>
         </w:rPr>
-        <w:t>Référentiel data — version 2</w:t>
+        <w:t>Référentiel data — CIBLE (idéal / TO-BE) — version 2</w:t>
       </w:r>
     </w:p>
     <w:p>
@@ -243,7 +243,7 @@
                 <w:b w:val="0"/>
                 <w:sz w:val="18"/>
               </w:rPr>
-              <w:t>2 — alignée sur le brief MoveUp</w:t>
+              <w:t>2 — CIBLE (idéal). Réalité Excel : voir le dictionnaire ACTUEL</w:t>
             </w:r>
           </w:p>
         </w:tc>
@@ -263,6 +263,45 @@
                 <w:b/>
                 <w:sz w:val="18"/>
               </w:rPr>
+              <w:t>Modèle</w:t>
+            </w:r>
+          </w:p>
+        </w:tc>
+        <w:tc>
+          <w:tcPr>
+            <w:tcW w:type="dxa" w:w="7488"/>
+          </w:tcPr>
+          <w:p>
+            <w:pPr>
+              <w:spacing w:after="20" w:before="20"/>
+            </w:pPr>
+            <w:r/>
+            <w:r>
+              <w:rPr>
+                <w:b w:val="0"/>
+                <w:sz w:val="18"/>
+              </w:rPr>
+              <w:t>10 entités reliées (8 CRM + 2 acquisition/marketing)</w:t>
+            </w:r>
+          </w:p>
+        </w:tc>
+      </w:tr>
+      <w:tr>
+        <w:tc>
+          <w:tcPr>
+            <w:tcW w:type="dxa" w:w="2304"/>
+            <w:shd w:val="clear" w:color="auto" w:fill="EEF3F8"/>
+          </w:tcPr>
+          <w:p>
+            <w:pPr>
+              <w:spacing w:after="20" w:before="20"/>
+            </w:pPr>
+            <w:r/>
+            <w:r>
+              <w:rPr>
+                <w:b/>
+                <w:sz w:val="18"/>
+              </w:rPr>
               <w:t>Note sigles</w:t>
             </w:r>
           </w:p>
@@ -270,6 +309,7 @@
         <w:tc>
           <w:tcPr>
             <w:tcW w:type="dxa" w:w="7488"/>
+            <w:shd w:val="clear" w:color="auto" w:fill="EEF3F8"/>
           </w:tcPr>
           <w:p>
             <w:pPr>
@@ -840,6 +880,11 @@
       </w:r>
     </w:p>
     <w:p>
+      <w:r>
+        <w:t>• Couche acquisition (amont) : fact_acquisition (canal × jour) + fact_newsletter (mensuel), reliées par canal + date → funnel dépense → clic → lead → adhésion → MRR.</w:t>
+      </w:r>
+    </w:p>
+    <w:p>
       <w:pPr>
         <w:spacing w:before="280" w:after="120"/>
         <w:pBdr>
@@ -923,7 +968,7 @@
                 <w:b/>
                 <w:sz w:val="18"/>
               </w:rPr>
-              <w:t>source (canal d'acquisition)</w:t>
+              <w:t>source / canal (acquisition)</w:t>
             </w:r>
           </w:p>
         </w:tc>
@@ -941,7 +986,7 @@
                 <w:b w:val="0"/>
                 <w:sz w:val="18"/>
               </w:rPr>
-              <w:t>instagram · google_ads · site_web · recommandation</w:t>
+              <w:t>instagram · google_ads · site_web · recommandation · newsletter</w:t>
             </w:r>
           </w:p>
         </w:tc>
@@ -7748,6 +7793,1681 @@
     </w:p>
     <w:p>
       <w:pPr>
+        <w:spacing w:before="160" w:after="60"/>
+      </w:pPr>
+      <w:r>
+        <w:rPr>
+          <w:b/>
+          <w:color w:val="16324F"/>
+          <w:sz w:val="23"/>
+        </w:rPr>
+        <w:t>4.9  fact_acquisition — Performance acquisition (canal × jour)</w:t>
+      </w:r>
+    </w:p>
+    <w:tbl>
+      <w:tblPr>
+        <w:tblStyle w:val="TableGrid"/>
+        <w:tblW w:type="auto" w:w="0"/>
+        <w:jc w:val="center"/>
+        <w:tblLook w:firstColumn="1" w:firstRow="1" w:lastColumn="0" w:lastRow="0" w:noHBand="0" w:noVBand="1" w:val="04A0"/>
+      </w:tblPr>
+      <w:tblGrid>
+        <w:gridCol w:w="2556"/>
+        <w:gridCol w:w="2556"/>
+        <w:gridCol w:w="2556"/>
+        <w:gridCol w:w="2556"/>
+      </w:tblGrid>
+      <w:tr>
+        <w:tc>
+          <w:tcPr>
+            <w:tcW w:type="dxa" w:w="2448"/>
+            <w:shd w:val="clear" w:color="auto" w:fill="2E5E8C"/>
+          </w:tcPr>
+          <w:p>
+            <w:pPr>
+              <w:spacing w:after="20" w:before="20"/>
+            </w:pPr>
+            <w:r/>
+            <w:r>
+              <w:rPr>
+                <w:b/>
+                <w:color w:val="FFFFFF"/>
+                <w:sz w:val="19"/>
+              </w:rPr>
+              <w:t>Variable</w:t>
+            </w:r>
+          </w:p>
+        </w:tc>
+        <w:tc>
+          <w:tcPr>
+            <w:tcW w:type="dxa" w:w="1296"/>
+            <w:shd w:val="clear" w:color="auto" w:fill="2E5E8C"/>
+          </w:tcPr>
+          <w:p>
+            <w:pPr>
+              <w:spacing w:after="20" w:before="20"/>
+            </w:pPr>
+            <w:r/>
+            <w:r>
+              <w:rPr>
+                <w:b/>
+                <w:color w:val="FFFFFF"/>
+                <w:sz w:val="19"/>
+              </w:rPr>
+              <w:t>Type</w:t>
+            </w:r>
+          </w:p>
+        </w:tc>
+        <w:tc>
+          <w:tcPr>
+            <w:tcW w:type="dxa" w:w="4896"/>
+            <w:shd w:val="clear" w:color="auto" w:fill="2E5E8C"/>
+          </w:tcPr>
+          <w:p>
+            <w:pPr>
+              <w:spacing w:after="20" w:before="20"/>
+            </w:pPr>
+            <w:r/>
+            <w:r>
+              <w:rPr>
+                <w:b/>
+                <w:color w:val="FFFFFF"/>
+                <w:sz w:val="19"/>
+              </w:rPr>
+              <w:t>Description</w:t>
+            </w:r>
+          </w:p>
+        </w:tc>
+        <w:tc>
+          <w:tcPr>
+            <w:tcW w:type="dxa" w:w="2160"/>
+            <w:shd w:val="clear" w:color="auto" w:fill="2E5E8C"/>
+          </w:tcPr>
+          <w:p>
+            <w:pPr>
+              <w:spacing w:after="20" w:before="20"/>
+            </w:pPr>
+            <w:r/>
+            <w:r>
+              <w:rPr>
+                <w:b/>
+                <w:color w:val="FFFFFF"/>
+                <w:sz w:val="19"/>
+              </w:rPr>
+              <w:t>Exemple</w:t>
+            </w:r>
+          </w:p>
+        </w:tc>
+      </w:tr>
+      <w:tr>
+        <w:tc>
+          <w:tcPr>
+            <w:tcW w:type="dxa" w:w="2448"/>
+          </w:tcPr>
+          <w:p>
+            <w:pPr>
+              <w:spacing w:after="20" w:before="20"/>
+            </w:pPr>
+            <w:r/>
+            <w:r>
+              <w:rPr>
+                <w:b/>
+                <w:sz w:val="18"/>
+              </w:rPr>
+              <w:t>acquisition_id (PK)</w:t>
+            </w:r>
+          </w:p>
+        </w:tc>
+        <w:tc>
+          <w:tcPr>
+            <w:tcW w:type="dxa" w:w="1296"/>
+          </w:tcPr>
+          <w:p>
+            <w:pPr>
+              <w:spacing w:after="20" w:before="20"/>
+            </w:pPr>
+            <w:r/>
+            <w:r>
+              <w:rPr>
+                <w:b w:val="0"/>
+                <w:sz w:val="18"/>
+              </w:rPr>
+              <w:t>ID</w:t>
+            </w:r>
+          </w:p>
+        </w:tc>
+        <w:tc>
+          <w:tcPr>
+            <w:tcW w:type="dxa" w:w="4896"/>
+          </w:tcPr>
+          <w:p>
+            <w:pPr>
+              <w:spacing w:after="20" w:before="20"/>
+            </w:pPr>
+            <w:r/>
+            <w:r>
+              <w:rPr>
+                <w:b w:val="0"/>
+                <w:sz w:val="18"/>
+              </w:rPr>
+              <w:t>Identifiant de ligne</w:t>
+            </w:r>
+          </w:p>
+        </w:tc>
+        <w:tc>
+          <w:tcPr>
+            <w:tcW w:type="dxa" w:w="2160"/>
+          </w:tcPr>
+          <w:p>
+            <w:pPr>
+              <w:spacing w:after="20" w:before="20"/>
+            </w:pPr>
+            <w:r/>
+            <w:r>
+              <w:rPr>
+                <w:b w:val="0"/>
+                <w:sz w:val="18"/>
+              </w:rPr>
+              <w:t>ACQ-00142</w:t>
+            </w:r>
+          </w:p>
+        </w:tc>
+      </w:tr>
+      <w:tr>
+        <w:tc>
+          <w:tcPr>
+            <w:tcW w:type="dxa" w:w="2448"/>
+            <w:shd w:val="clear" w:color="auto" w:fill="EEF3F8"/>
+          </w:tcPr>
+          <w:p>
+            <w:pPr>
+              <w:spacing w:after="20" w:before="20"/>
+            </w:pPr>
+            <w:r/>
+            <w:r>
+              <w:rPr>
+                <w:b/>
+                <w:sz w:val="18"/>
+              </w:rPr>
+              <w:t>date</w:t>
+            </w:r>
+          </w:p>
+        </w:tc>
+        <w:tc>
+          <w:tcPr>
+            <w:tcW w:type="dxa" w:w="1296"/>
+            <w:shd w:val="clear" w:color="auto" w:fill="EEF3F8"/>
+          </w:tcPr>
+          <w:p>
+            <w:pPr>
+              <w:spacing w:after="20" w:before="20"/>
+            </w:pPr>
+            <w:r/>
+            <w:r>
+              <w:rPr>
+                <w:b w:val="0"/>
+                <w:sz w:val="18"/>
+              </w:rPr>
+              <w:t>Date</w:t>
+            </w:r>
+          </w:p>
+        </w:tc>
+        <w:tc>
+          <w:tcPr>
+            <w:tcW w:type="dxa" w:w="4896"/>
+            <w:shd w:val="clear" w:color="auto" w:fill="EEF3F8"/>
+          </w:tcPr>
+          <w:p>
+            <w:pPr>
+              <w:spacing w:after="20" w:before="20"/>
+            </w:pPr>
+            <w:r/>
+            <w:r>
+              <w:rPr>
+                <w:b w:val="0"/>
+                <w:sz w:val="18"/>
+              </w:rPr>
+              <w:t>Jour</w:t>
+            </w:r>
+          </w:p>
+        </w:tc>
+        <w:tc>
+          <w:tcPr>
+            <w:tcW w:type="dxa" w:w="2160"/>
+            <w:shd w:val="clear" w:color="auto" w:fill="EEF3F8"/>
+          </w:tcPr>
+          <w:p>
+            <w:pPr>
+              <w:spacing w:after="20" w:before="20"/>
+            </w:pPr>
+            <w:r/>
+            <w:r>
+              <w:rPr>
+                <w:b w:val="0"/>
+                <w:sz w:val="18"/>
+              </w:rPr>
+              <w:t>2026-06-15</w:t>
+            </w:r>
+          </w:p>
+        </w:tc>
+      </w:tr>
+      <w:tr>
+        <w:tc>
+          <w:tcPr>
+            <w:tcW w:type="dxa" w:w="2448"/>
+          </w:tcPr>
+          <w:p>
+            <w:pPr>
+              <w:spacing w:after="20" w:before="20"/>
+            </w:pPr>
+            <w:r/>
+            <w:r>
+              <w:rPr>
+                <w:b/>
+                <w:sz w:val="18"/>
+              </w:rPr>
+              <w:t>canal</w:t>
+            </w:r>
+          </w:p>
+        </w:tc>
+        <w:tc>
+          <w:tcPr>
+            <w:tcW w:type="dxa" w:w="1296"/>
+          </w:tcPr>
+          <w:p>
+            <w:pPr>
+              <w:spacing w:after="20" w:before="20"/>
+            </w:pPr>
+            <w:r/>
+            <w:r>
+              <w:rPr>
+                <w:b w:val="0"/>
+                <w:sz w:val="18"/>
+              </w:rPr>
+              <w:t>Énum</w:t>
+            </w:r>
+          </w:p>
+        </w:tc>
+        <w:tc>
+          <w:tcPr>
+            <w:tcW w:type="dxa" w:w="4896"/>
+          </w:tcPr>
+          <w:p>
+            <w:pPr>
+              <w:spacing w:after="20" w:before="20"/>
+            </w:pPr>
+            <w:r/>
+            <w:r>
+              <w:rPr>
+                <w:b w:val="0"/>
+                <w:sz w:val="18"/>
+              </w:rPr>
+              <w:t>Canal d'acquisition</w:t>
+            </w:r>
+          </w:p>
+        </w:tc>
+        <w:tc>
+          <w:tcPr>
+            <w:tcW w:type="dxa" w:w="2160"/>
+          </w:tcPr>
+          <w:p>
+            <w:pPr>
+              <w:spacing w:after="20" w:before="20"/>
+            </w:pPr>
+            <w:r/>
+            <w:r>
+              <w:rPr>
+                <w:b w:val="0"/>
+                <w:sz w:val="18"/>
+              </w:rPr>
+              <w:t>instagram</w:t>
+            </w:r>
+          </w:p>
+        </w:tc>
+      </w:tr>
+      <w:tr>
+        <w:tc>
+          <w:tcPr>
+            <w:tcW w:type="dxa" w:w="2448"/>
+            <w:shd w:val="clear" w:color="auto" w:fill="EEF3F8"/>
+          </w:tcPr>
+          <w:p>
+            <w:pPr>
+              <w:spacing w:after="20" w:before="20"/>
+            </w:pPr>
+            <w:r/>
+            <w:r>
+              <w:rPr>
+                <w:b/>
+                <w:sz w:val="18"/>
+              </w:rPr>
+              <w:t>campagne</w:t>
+            </w:r>
+          </w:p>
+        </w:tc>
+        <w:tc>
+          <w:tcPr>
+            <w:tcW w:type="dxa" w:w="1296"/>
+            <w:shd w:val="clear" w:color="auto" w:fill="EEF3F8"/>
+          </w:tcPr>
+          <w:p>
+            <w:pPr>
+              <w:spacing w:after="20" w:before="20"/>
+            </w:pPr>
+            <w:r/>
+            <w:r>
+              <w:rPr>
+                <w:b w:val="0"/>
+                <w:sz w:val="18"/>
+              </w:rPr>
+              <w:t>Texte</w:t>
+            </w:r>
+          </w:p>
+        </w:tc>
+        <w:tc>
+          <w:tcPr>
+            <w:tcW w:type="dxa" w:w="4896"/>
+            <w:shd w:val="clear" w:color="auto" w:fill="EEF3F8"/>
+          </w:tcPr>
+          <w:p>
+            <w:pPr>
+              <w:spacing w:after="20" w:before="20"/>
+            </w:pPr>
+            <w:r/>
+            <w:r>
+              <w:rPr>
+                <w:b w:val="0"/>
+                <w:sz w:val="18"/>
+              </w:rPr>
+              <w:t>Campagne</w:t>
+            </w:r>
+          </w:p>
+        </w:tc>
+        <w:tc>
+          <w:tcPr>
+            <w:tcW w:type="dxa" w:w="2160"/>
+            <w:shd w:val="clear" w:color="auto" w:fill="EEF3F8"/>
+          </w:tcPr>
+          <w:p>
+            <w:pPr>
+              <w:spacing w:after="20" w:before="20"/>
+            </w:pPr>
+            <w:r/>
+            <w:r>
+              <w:rPr>
+                <w:b w:val="0"/>
+                <w:sz w:val="18"/>
+              </w:rPr>
+              <w:t>insta_rentree</w:t>
+            </w:r>
+          </w:p>
+        </w:tc>
+      </w:tr>
+      <w:tr>
+        <w:tc>
+          <w:tcPr>
+            <w:tcW w:type="dxa" w:w="2448"/>
+          </w:tcPr>
+          <w:p>
+            <w:pPr>
+              <w:spacing w:after="20" w:before="20"/>
+            </w:pPr>
+            <w:r/>
+            <w:r>
+              <w:rPr>
+                <w:b/>
+                <w:sz w:val="18"/>
+              </w:rPr>
+              <w:t>depense</w:t>
+            </w:r>
+          </w:p>
+        </w:tc>
+        <w:tc>
+          <w:tcPr>
+            <w:tcW w:type="dxa" w:w="1296"/>
+          </w:tcPr>
+          <w:p>
+            <w:pPr>
+              <w:spacing w:after="20" w:before="20"/>
+            </w:pPr>
+            <w:r/>
+            <w:r>
+              <w:rPr>
+                <w:b w:val="0"/>
+                <w:sz w:val="18"/>
+              </w:rPr>
+              <w:t>Décimal</w:t>
+            </w:r>
+          </w:p>
+        </w:tc>
+        <w:tc>
+          <w:tcPr>
+            <w:tcW w:type="dxa" w:w="4896"/>
+          </w:tcPr>
+          <w:p>
+            <w:pPr>
+              <w:spacing w:after="20" w:before="20"/>
+            </w:pPr>
+            <w:r/>
+            <w:r>
+              <w:rPr>
+                <w:b w:val="0"/>
+                <w:sz w:val="18"/>
+              </w:rPr>
+              <w:t>€ dépensés (0 si organique)</w:t>
+            </w:r>
+          </w:p>
+        </w:tc>
+        <w:tc>
+          <w:tcPr>
+            <w:tcW w:type="dxa" w:w="2160"/>
+          </w:tcPr>
+          <w:p>
+            <w:pPr>
+              <w:spacing w:after="20" w:before="20"/>
+            </w:pPr>
+            <w:r/>
+            <w:r>
+              <w:rPr>
+                <w:b w:val="0"/>
+                <w:sz w:val="18"/>
+              </w:rPr>
+              <w:t>120.50</w:t>
+            </w:r>
+          </w:p>
+        </w:tc>
+      </w:tr>
+      <w:tr>
+        <w:tc>
+          <w:tcPr>
+            <w:tcW w:type="dxa" w:w="2448"/>
+            <w:shd w:val="clear" w:color="auto" w:fill="EEF3F8"/>
+          </w:tcPr>
+          <w:p>
+            <w:pPr>
+              <w:spacing w:after="20" w:before="20"/>
+            </w:pPr>
+            <w:r/>
+            <w:r>
+              <w:rPr>
+                <w:b/>
+                <w:sz w:val="18"/>
+              </w:rPr>
+              <w:t>impressions</w:t>
+            </w:r>
+          </w:p>
+        </w:tc>
+        <w:tc>
+          <w:tcPr>
+            <w:tcW w:type="dxa" w:w="1296"/>
+            <w:shd w:val="clear" w:color="auto" w:fill="EEF3F8"/>
+          </w:tcPr>
+          <w:p>
+            <w:pPr>
+              <w:spacing w:after="20" w:before="20"/>
+            </w:pPr>
+            <w:r/>
+            <w:r>
+              <w:rPr>
+                <w:b w:val="0"/>
+                <w:sz w:val="18"/>
+              </w:rPr>
+              <w:t>Entier</w:t>
+            </w:r>
+          </w:p>
+        </w:tc>
+        <w:tc>
+          <w:tcPr>
+            <w:tcW w:type="dxa" w:w="4896"/>
+            <w:shd w:val="clear" w:color="auto" w:fill="EEF3F8"/>
+          </w:tcPr>
+          <w:p>
+            <w:pPr>
+              <w:spacing w:after="20" w:before="20"/>
+            </w:pPr>
+            <w:r/>
+            <w:r>
+              <w:rPr>
+                <w:b w:val="0"/>
+                <w:sz w:val="18"/>
+              </w:rPr>
+              <w:t>Affichages pub (NULL si organique)</w:t>
+            </w:r>
+          </w:p>
+        </w:tc>
+        <w:tc>
+          <w:tcPr>
+            <w:tcW w:type="dxa" w:w="2160"/>
+            <w:shd w:val="clear" w:color="auto" w:fill="EEF3F8"/>
+          </w:tcPr>
+          <w:p>
+            <w:pPr>
+              <w:spacing w:after="20" w:before="20"/>
+            </w:pPr>
+            <w:r/>
+            <w:r>
+              <w:rPr>
+                <w:b w:val="0"/>
+                <w:sz w:val="18"/>
+              </w:rPr>
+              <w:t>8200</w:t>
+            </w:r>
+          </w:p>
+        </w:tc>
+      </w:tr>
+      <w:tr>
+        <w:tc>
+          <w:tcPr>
+            <w:tcW w:type="dxa" w:w="2448"/>
+          </w:tcPr>
+          <w:p>
+            <w:pPr>
+              <w:spacing w:after="20" w:before="20"/>
+            </w:pPr>
+            <w:r/>
+            <w:r>
+              <w:rPr>
+                <w:b/>
+                <w:sz w:val="18"/>
+              </w:rPr>
+              <w:t>clics</w:t>
+            </w:r>
+          </w:p>
+        </w:tc>
+        <w:tc>
+          <w:tcPr>
+            <w:tcW w:type="dxa" w:w="1296"/>
+          </w:tcPr>
+          <w:p>
+            <w:pPr>
+              <w:spacing w:after="20" w:before="20"/>
+            </w:pPr>
+            <w:r/>
+            <w:r>
+              <w:rPr>
+                <w:b w:val="0"/>
+                <w:sz w:val="18"/>
+              </w:rPr>
+              <w:t>Entier</w:t>
+            </w:r>
+          </w:p>
+        </w:tc>
+        <w:tc>
+          <w:tcPr>
+            <w:tcW w:type="dxa" w:w="4896"/>
+          </w:tcPr>
+          <w:p>
+            <w:pPr>
+              <w:spacing w:after="20" w:before="20"/>
+            </w:pPr>
+            <w:r/>
+            <w:r>
+              <w:rPr>
+                <w:b w:val="0"/>
+                <w:sz w:val="18"/>
+              </w:rPr>
+              <w:t>Clics pub (NULL si organique)</w:t>
+            </w:r>
+          </w:p>
+        </w:tc>
+        <w:tc>
+          <w:tcPr>
+            <w:tcW w:type="dxa" w:w="2160"/>
+          </w:tcPr>
+          <w:p>
+            <w:pPr>
+              <w:spacing w:after="20" w:before="20"/>
+            </w:pPr>
+            <w:r/>
+            <w:r>
+              <w:rPr>
+                <w:b w:val="0"/>
+                <w:sz w:val="18"/>
+              </w:rPr>
+              <w:t>98</w:t>
+            </w:r>
+          </w:p>
+        </w:tc>
+      </w:tr>
+      <w:tr>
+        <w:tc>
+          <w:tcPr>
+            <w:tcW w:type="dxa" w:w="2448"/>
+            <w:shd w:val="clear" w:color="auto" w:fill="EEF3F8"/>
+          </w:tcPr>
+          <w:p>
+            <w:pPr>
+              <w:spacing w:after="20" w:before="20"/>
+            </w:pPr>
+            <w:r/>
+            <w:r>
+              <w:rPr>
+                <w:b/>
+                <w:sz w:val="18"/>
+              </w:rPr>
+              <w:t>ctr</w:t>
+            </w:r>
+          </w:p>
+        </w:tc>
+        <w:tc>
+          <w:tcPr>
+            <w:tcW w:type="dxa" w:w="1296"/>
+            <w:shd w:val="clear" w:color="auto" w:fill="EEF3F8"/>
+          </w:tcPr>
+          <w:p>
+            <w:pPr>
+              <w:spacing w:after="20" w:before="20"/>
+            </w:pPr>
+            <w:r/>
+            <w:r>
+              <w:rPr>
+                <w:b w:val="0"/>
+                <w:sz w:val="18"/>
+              </w:rPr>
+              <w:t>Décimal</w:t>
+            </w:r>
+          </w:p>
+        </w:tc>
+        <w:tc>
+          <w:tcPr>
+            <w:tcW w:type="dxa" w:w="4896"/>
+            <w:shd w:val="clear" w:color="auto" w:fill="EEF3F8"/>
+          </w:tcPr>
+          <w:p>
+            <w:pPr>
+              <w:spacing w:after="20" w:before="20"/>
+            </w:pPr>
+            <w:r/>
+            <w:r>
+              <w:rPr>
+                <w:b w:val="0"/>
+                <w:sz w:val="18"/>
+              </w:rPr>
+              <w:t>Taux de clic = clics / impressions</w:t>
+            </w:r>
+          </w:p>
+        </w:tc>
+        <w:tc>
+          <w:tcPr>
+            <w:tcW w:type="dxa" w:w="2160"/>
+            <w:shd w:val="clear" w:color="auto" w:fill="EEF3F8"/>
+          </w:tcPr>
+          <w:p>
+            <w:pPr>
+              <w:spacing w:after="20" w:before="20"/>
+            </w:pPr>
+            <w:r/>
+            <w:r>
+              <w:rPr>
+                <w:b w:val="0"/>
+                <w:sz w:val="18"/>
+              </w:rPr>
+              <w:t>0.0120</w:t>
+            </w:r>
+          </w:p>
+        </w:tc>
+      </w:tr>
+      <w:tr>
+        <w:tc>
+          <w:tcPr>
+            <w:tcW w:type="dxa" w:w="2448"/>
+          </w:tcPr>
+          <w:p>
+            <w:pPr>
+              <w:spacing w:after="20" w:before="20"/>
+            </w:pPr>
+            <w:r/>
+            <w:r>
+              <w:rPr>
+                <w:b/>
+                <w:sz w:val="18"/>
+              </w:rPr>
+              <w:t>sessions_site</w:t>
+            </w:r>
+          </w:p>
+        </w:tc>
+        <w:tc>
+          <w:tcPr>
+            <w:tcW w:type="dxa" w:w="1296"/>
+          </w:tcPr>
+          <w:p>
+            <w:pPr>
+              <w:spacing w:after="20" w:before="20"/>
+            </w:pPr>
+            <w:r/>
+            <w:r>
+              <w:rPr>
+                <w:b w:val="0"/>
+                <w:sz w:val="18"/>
+              </w:rPr>
+              <w:t>Entier</w:t>
+            </w:r>
+          </w:p>
+        </w:tc>
+        <w:tc>
+          <w:tcPr>
+            <w:tcW w:type="dxa" w:w="4896"/>
+          </w:tcPr>
+          <w:p>
+            <w:pPr>
+              <w:spacing w:after="20" w:before="20"/>
+            </w:pPr>
+            <w:r/>
+            <w:r>
+              <w:rPr>
+                <w:b w:val="0"/>
+                <w:sz w:val="18"/>
+              </w:rPr>
+              <w:t>Sessions web attribuées au canal</w:t>
+            </w:r>
+          </w:p>
+        </w:tc>
+        <w:tc>
+          <w:tcPr>
+            <w:tcW w:type="dxa" w:w="2160"/>
+          </w:tcPr>
+          <w:p>
+            <w:pPr>
+              <w:spacing w:after="20" w:before="20"/>
+            </w:pPr>
+            <w:r/>
+            <w:r>
+              <w:rPr>
+                <w:b w:val="0"/>
+                <w:sz w:val="18"/>
+              </w:rPr>
+              <w:t>92</w:t>
+            </w:r>
+          </w:p>
+        </w:tc>
+      </w:tr>
+      <w:tr>
+        <w:tc>
+          <w:tcPr>
+            <w:tcW w:type="dxa" w:w="2448"/>
+            <w:shd w:val="clear" w:color="auto" w:fill="EEF3F8"/>
+          </w:tcPr>
+          <w:p>
+            <w:pPr>
+              <w:spacing w:after="20" w:before="20"/>
+            </w:pPr>
+            <w:r/>
+            <w:r>
+              <w:rPr>
+                <w:b/>
+                <w:sz w:val="18"/>
+              </w:rPr>
+              <w:t>temps_moyen_site_sec</w:t>
+            </w:r>
+          </w:p>
+        </w:tc>
+        <w:tc>
+          <w:tcPr>
+            <w:tcW w:type="dxa" w:w="1296"/>
+            <w:shd w:val="clear" w:color="auto" w:fill="EEF3F8"/>
+          </w:tcPr>
+          <w:p>
+            <w:pPr>
+              <w:spacing w:after="20" w:before="20"/>
+            </w:pPr>
+            <w:r/>
+            <w:r>
+              <w:rPr>
+                <w:b w:val="0"/>
+                <w:sz w:val="18"/>
+              </w:rPr>
+              <w:t>Entier</w:t>
+            </w:r>
+          </w:p>
+        </w:tc>
+        <w:tc>
+          <w:tcPr>
+            <w:tcW w:type="dxa" w:w="4896"/>
+            <w:shd w:val="clear" w:color="auto" w:fill="EEF3F8"/>
+          </w:tcPr>
+          <w:p>
+            <w:pPr>
+              <w:spacing w:after="20" w:before="20"/>
+            </w:pPr>
+            <w:r/>
+            <w:r>
+              <w:rPr>
+                <w:b w:val="0"/>
+                <w:sz w:val="18"/>
+              </w:rPr>
+              <w:t>Temps moyen sur le site (secondes)</w:t>
+            </w:r>
+          </w:p>
+        </w:tc>
+        <w:tc>
+          <w:tcPr>
+            <w:tcW w:type="dxa" w:w="2160"/>
+            <w:shd w:val="clear" w:color="auto" w:fill="EEF3F8"/>
+          </w:tcPr>
+          <w:p>
+            <w:pPr>
+              <w:spacing w:after="20" w:before="20"/>
+            </w:pPr>
+            <w:r/>
+            <w:r>
+              <w:rPr>
+                <w:b w:val="0"/>
+                <w:sz w:val="18"/>
+              </w:rPr>
+              <w:t>74</w:t>
+            </w:r>
+          </w:p>
+        </w:tc>
+      </w:tr>
+      <w:tr>
+        <w:tc>
+          <w:tcPr>
+            <w:tcW w:type="dxa" w:w="2448"/>
+          </w:tcPr>
+          <w:p>
+            <w:pPr>
+              <w:spacing w:after="20" w:before="20"/>
+            </w:pPr>
+            <w:r/>
+            <w:r>
+              <w:rPr>
+                <w:b/>
+                <w:sz w:val="18"/>
+              </w:rPr>
+              <w:t>taux_rebond</w:t>
+            </w:r>
+          </w:p>
+        </w:tc>
+        <w:tc>
+          <w:tcPr>
+            <w:tcW w:type="dxa" w:w="1296"/>
+          </w:tcPr>
+          <w:p>
+            <w:pPr>
+              <w:spacing w:after="20" w:before="20"/>
+            </w:pPr>
+            <w:r/>
+            <w:r>
+              <w:rPr>
+                <w:b w:val="0"/>
+                <w:sz w:val="18"/>
+              </w:rPr>
+              <w:t>Décimal</w:t>
+            </w:r>
+          </w:p>
+        </w:tc>
+        <w:tc>
+          <w:tcPr>
+            <w:tcW w:type="dxa" w:w="4896"/>
+          </w:tcPr>
+          <w:p>
+            <w:pPr>
+              <w:spacing w:after="20" w:before="20"/>
+            </w:pPr>
+            <w:r/>
+            <w:r>
+              <w:rPr>
+                <w:b w:val="0"/>
+                <w:sz w:val="18"/>
+              </w:rPr>
+              <w:t>Part de sessions sans interaction</w:t>
+            </w:r>
+          </w:p>
+        </w:tc>
+        <w:tc>
+          <w:tcPr>
+            <w:tcW w:type="dxa" w:w="2160"/>
+          </w:tcPr>
+          <w:p>
+            <w:pPr>
+              <w:spacing w:after="20" w:before="20"/>
+            </w:pPr>
+            <w:r/>
+            <w:r>
+              <w:rPr>
+                <w:b w:val="0"/>
+                <w:sz w:val="18"/>
+              </w:rPr>
+              <w:t>0.61</w:t>
+            </w:r>
+          </w:p>
+        </w:tc>
+      </w:tr>
+      <w:tr>
+        <w:tc>
+          <w:tcPr>
+            <w:tcW w:type="dxa" w:w="2448"/>
+            <w:shd w:val="clear" w:color="auto" w:fill="EEF3F8"/>
+          </w:tcPr>
+          <w:p>
+            <w:pPr>
+              <w:spacing w:after="20" w:before="20"/>
+            </w:pPr>
+            <w:r/>
+            <w:r>
+              <w:rPr>
+                <w:b/>
+                <w:sz w:val="18"/>
+              </w:rPr>
+              <w:t>leads_generes</w:t>
+            </w:r>
+          </w:p>
+        </w:tc>
+        <w:tc>
+          <w:tcPr>
+            <w:tcW w:type="dxa" w:w="1296"/>
+            <w:shd w:val="clear" w:color="auto" w:fill="EEF3F8"/>
+          </w:tcPr>
+          <w:p>
+            <w:pPr>
+              <w:spacing w:after="20" w:before="20"/>
+            </w:pPr>
+            <w:r/>
+            <w:r>
+              <w:rPr>
+                <w:b w:val="0"/>
+                <w:sz w:val="18"/>
+              </w:rPr>
+              <w:t>Entier</w:t>
+            </w:r>
+          </w:p>
+        </w:tc>
+        <w:tc>
+          <w:tcPr>
+            <w:tcW w:type="dxa" w:w="4896"/>
+            <w:shd w:val="clear" w:color="auto" w:fill="EEF3F8"/>
+          </w:tcPr>
+          <w:p>
+            <w:pPr>
+              <w:spacing w:after="20" w:before="20"/>
+            </w:pPr>
+            <w:r/>
+            <w:r>
+              <w:rPr>
+                <w:b w:val="0"/>
+                <w:sz w:val="18"/>
+              </w:rPr>
+              <w:t>Leads issus du canal ce jour</w:t>
+            </w:r>
+          </w:p>
+        </w:tc>
+        <w:tc>
+          <w:tcPr>
+            <w:tcW w:type="dxa" w:w="2160"/>
+            <w:shd w:val="clear" w:color="auto" w:fill="EEF3F8"/>
+          </w:tcPr>
+          <w:p>
+            <w:pPr>
+              <w:spacing w:after="20" w:before="20"/>
+            </w:pPr>
+            <w:r/>
+            <w:r>
+              <w:rPr>
+                <w:b w:val="0"/>
+                <w:sz w:val="18"/>
+              </w:rPr>
+              <w:t>3</w:t>
+            </w:r>
+          </w:p>
+        </w:tc>
+      </w:tr>
+      <w:tr>
+        <w:tc>
+          <w:tcPr>
+            <w:tcW w:type="dxa" w:w="2448"/>
+          </w:tcPr>
+          <w:p>
+            <w:pPr>
+              <w:spacing w:after="20" w:before="20"/>
+            </w:pPr>
+            <w:r/>
+            <w:r>
+              <w:rPr>
+                <w:b/>
+                <w:sz w:val="18"/>
+              </w:rPr>
+              <w:t>cpl</w:t>
+            </w:r>
+          </w:p>
+        </w:tc>
+        <w:tc>
+          <w:tcPr>
+            <w:tcW w:type="dxa" w:w="1296"/>
+          </w:tcPr>
+          <w:p>
+            <w:pPr>
+              <w:spacing w:after="20" w:before="20"/>
+            </w:pPr>
+            <w:r/>
+            <w:r>
+              <w:rPr>
+                <w:b w:val="0"/>
+                <w:sz w:val="18"/>
+              </w:rPr>
+              <w:t>Décimal</w:t>
+            </w:r>
+          </w:p>
+        </w:tc>
+        <w:tc>
+          <w:tcPr>
+            <w:tcW w:type="dxa" w:w="4896"/>
+          </w:tcPr>
+          <w:p>
+            <w:pPr>
+              <w:spacing w:after="20" w:before="20"/>
+            </w:pPr>
+            <w:r/>
+            <w:r>
+              <w:rPr>
+                <w:b w:val="0"/>
+                <w:sz w:val="18"/>
+              </w:rPr>
+              <w:t>Coût par lead = depense / leads_generes</w:t>
+            </w:r>
+          </w:p>
+        </w:tc>
+        <w:tc>
+          <w:tcPr>
+            <w:tcW w:type="dxa" w:w="2160"/>
+          </w:tcPr>
+          <w:p>
+            <w:pPr>
+              <w:spacing w:after="20" w:before="20"/>
+            </w:pPr>
+            <w:r/>
+            <w:r>
+              <w:rPr>
+                <w:b w:val="0"/>
+                <w:sz w:val="18"/>
+              </w:rPr>
+              <w:t>18.30</w:t>
+            </w:r>
+          </w:p>
+        </w:tc>
+      </w:tr>
+    </w:tbl>
+    <w:p>
+      <w:pPr>
+        <w:spacing w:after="80"/>
+      </w:pPr>
+    </w:p>
+    <w:p>
+      <w:r>
+        <w:t>Relié au reste par canal (= source) + date → ROI par canal et funnel complet dépense → MRR.</w:t>
+      </w:r>
+    </w:p>
+    <w:p>
+      <w:pPr>
+        <w:spacing w:before="160" w:after="60"/>
+      </w:pPr>
+      <w:r>
+        <w:rPr>
+          <w:b/>
+          <w:color w:val="16324F"/>
+          <w:sz w:val="23"/>
+        </w:rPr>
+        <w:t>4.10  fact_newsletter — Emailing / nurturing (mensuel)</w:t>
+      </w:r>
+    </w:p>
+    <w:tbl>
+      <w:tblPr>
+        <w:tblStyle w:val="TableGrid"/>
+        <w:tblW w:type="auto" w:w="0"/>
+        <w:jc w:val="center"/>
+        <w:tblLook w:firstColumn="1" w:firstRow="1" w:lastColumn="0" w:lastRow="0" w:noHBand="0" w:noVBand="1" w:val="04A0"/>
+      </w:tblPr>
+      <w:tblGrid>
+        <w:gridCol w:w="2556"/>
+        <w:gridCol w:w="2556"/>
+        <w:gridCol w:w="2556"/>
+        <w:gridCol w:w="2556"/>
+      </w:tblGrid>
+      <w:tr>
+        <w:tc>
+          <w:tcPr>
+            <w:tcW w:type="dxa" w:w="2448"/>
+            <w:shd w:val="clear" w:color="auto" w:fill="2E5E8C"/>
+          </w:tcPr>
+          <w:p>
+            <w:pPr>
+              <w:spacing w:after="20" w:before="20"/>
+            </w:pPr>
+            <w:r/>
+            <w:r>
+              <w:rPr>
+                <w:b/>
+                <w:color w:val="FFFFFF"/>
+                <w:sz w:val="19"/>
+              </w:rPr>
+              <w:t>Variable</w:t>
+            </w:r>
+          </w:p>
+        </w:tc>
+        <w:tc>
+          <w:tcPr>
+            <w:tcW w:type="dxa" w:w="1296"/>
+            <w:shd w:val="clear" w:color="auto" w:fill="2E5E8C"/>
+          </w:tcPr>
+          <w:p>
+            <w:pPr>
+              <w:spacing w:after="20" w:before="20"/>
+            </w:pPr>
+            <w:r/>
+            <w:r>
+              <w:rPr>
+                <w:b/>
+                <w:color w:val="FFFFFF"/>
+                <w:sz w:val="19"/>
+              </w:rPr>
+              <w:t>Type</w:t>
+            </w:r>
+          </w:p>
+        </w:tc>
+        <w:tc>
+          <w:tcPr>
+            <w:tcW w:type="dxa" w:w="4896"/>
+            <w:shd w:val="clear" w:color="auto" w:fill="2E5E8C"/>
+          </w:tcPr>
+          <w:p>
+            <w:pPr>
+              <w:spacing w:after="20" w:before="20"/>
+            </w:pPr>
+            <w:r/>
+            <w:r>
+              <w:rPr>
+                <w:b/>
+                <w:color w:val="FFFFFF"/>
+                <w:sz w:val="19"/>
+              </w:rPr>
+              <w:t>Description</w:t>
+            </w:r>
+          </w:p>
+        </w:tc>
+        <w:tc>
+          <w:tcPr>
+            <w:tcW w:type="dxa" w:w="2160"/>
+            <w:shd w:val="clear" w:color="auto" w:fill="2E5E8C"/>
+          </w:tcPr>
+          <w:p>
+            <w:pPr>
+              <w:spacing w:after="20" w:before="20"/>
+            </w:pPr>
+            <w:r/>
+            <w:r>
+              <w:rPr>
+                <w:b/>
+                <w:color w:val="FFFFFF"/>
+                <w:sz w:val="19"/>
+              </w:rPr>
+              <w:t>Exemple</w:t>
+            </w:r>
+          </w:p>
+        </w:tc>
+      </w:tr>
+      <w:tr>
+        <w:tc>
+          <w:tcPr>
+            <w:tcW w:type="dxa" w:w="2448"/>
+          </w:tcPr>
+          <w:p>
+            <w:pPr>
+              <w:spacing w:after="20" w:before="20"/>
+            </w:pPr>
+            <w:r/>
+            <w:r>
+              <w:rPr>
+                <w:b/>
+                <w:sz w:val="18"/>
+              </w:rPr>
+              <w:t>date (PK)</w:t>
+            </w:r>
+          </w:p>
+        </w:tc>
+        <w:tc>
+          <w:tcPr>
+            <w:tcW w:type="dxa" w:w="1296"/>
+          </w:tcPr>
+          <w:p>
+            <w:pPr>
+              <w:spacing w:after="20" w:before="20"/>
+            </w:pPr>
+            <w:r/>
+            <w:r>
+              <w:rPr>
+                <w:b w:val="0"/>
+                <w:sz w:val="18"/>
+              </w:rPr>
+              <w:t>Texte</w:t>
+            </w:r>
+          </w:p>
+        </w:tc>
+        <w:tc>
+          <w:tcPr>
+            <w:tcW w:type="dxa" w:w="4896"/>
+          </w:tcPr>
+          <w:p>
+            <w:pPr>
+              <w:spacing w:after="20" w:before="20"/>
+            </w:pPr>
+            <w:r/>
+            <w:r>
+              <w:rPr>
+                <w:b w:val="0"/>
+                <w:sz w:val="18"/>
+              </w:rPr>
+              <w:t>Mois (AAAA-MM)</w:t>
+            </w:r>
+          </w:p>
+        </w:tc>
+        <w:tc>
+          <w:tcPr>
+            <w:tcW w:type="dxa" w:w="2160"/>
+          </w:tcPr>
+          <w:p>
+            <w:pPr>
+              <w:spacing w:after="20" w:before="20"/>
+            </w:pPr>
+            <w:r/>
+            <w:r>
+              <w:rPr>
+                <w:b w:val="0"/>
+                <w:sz w:val="18"/>
+              </w:rPr>
+              <w:t>2026-06</w:t>
+            </w:r>
+          </w:p>
+        </w:tc>
+      </w:tr>
+      <w:tr>
+        <w:tc>
+          <w:tcPr>
+            <w:tcW w:type="dxa" w:w="2448"/>
+            <w:shd w:val="clear" w:color="auto" w:fill="EEF3F8"/>
+          </w:tcPr>
+          <w:p>
+            <w:pPr>
+              <w:spacing w:after="20" w:before="20"/>
+            </w:pPr>
+            <w:r/>
+            <w:r>
+              <w:rPr>
+                <w:b/>
+                <w:sz w:val="18"/>
+              </w:rPr>
+              <w:t>abonnes</w:t>
+            </w:r>
+          </w:p>
+        </w:tc>
+        <w:tc>
+          <w:tcPr>
+            <w:tcW w:type="dxa" w:w="1296"/>
+            <w:shd w:val="clear" w:color="auto" w:fill="EEF3F8"/>
+          </w:tcPr>
+          <w:p>
+            <w:pPr>
+              <w:spacing w:after="20" w:before="20"/>
+            </w:pPr>
+            <w:r/>
+            <w:r>
+              <w:rPr>
+                <w:b w:val="0"/>
+                <w:sz w:val="18"/>
+              </w:rPr>
+              <w:t>Entier</w:t>
+            </w:r>
+          </w:p>
+        </w:tc>
+        <w:tc>
+          <w:tcPr>
+            <w:tcW w:type="dxa" w:w="4896"/>
+            <w:shd w:val="clear" w:color="auto" w:fill="EEF3F8"/>
+          </w:tcPr>
+          <w:p>
+            <w:pPr>
+              <w:spacing w:after="20" w:before="20"/>
+            </w:pPr>
+            <w:r/>
+            <w:r>
+              <w:rPr>
+                <w:b w:val="0"/>
+                <w:sz w:val="18"/>
+              </w:rPr>
+              <w:t>Base d'abonnés en fin de mois</w:t>
+            </w:r>
+          </w:p>
+        </w:tc>
+        <w:tc>
+          <w:tcPr>
+            <w:tcW w:type="dxa" w:w="2160"/>
+            <w:shd w:val="clear" w:color="auto" w:fill="EEF3F8"/>
+          </w:tcPr>
+          <w:p>
+            <w:pPr>
+              <w:spacing w:after="20" w:before="20"/>
+            </w:pPr>
+            <w:r/>
+            <w:r>
+              <w:rPr>
+                <w:b w:val="0"/>
+                <w:sz w:val="18"/>
+              </w:rPr>
+              <w:t>3403</w:t>
+            </w:r>
+          </w:p>
+        </w:tc>
+      </w:tr>
+      <w:tr>
+        <w:tc>
+          <w:tcPr>
+            <w:tcW w:type="dxa" w:w="2448"/>
+          </w:tcPr>
+          <w:p>
+            <w:pPr>
+              <w:spacing w:after="20" w:before="20"/>
+            </w:pPr>
+            <w:r/>
+            <w:r>
+              <w:rPr>
+                <w:b/>
+                <w:sz w:val="18"/>
+              </w:rPr>
+              <w:t>nouveaux_abonnes</w:t>
+            </w:r>
+          </w:p>
+        </w:tc>
+        <w:tc>
+          <w:tcPr>
+            <w:tcW w:type="dxa" w:w="1296"/>
+          </w:tcPr>
+          <w:p>
+            <w:pPr>
+              <w:spacing w:after="20" w:before="20"/>
+            </w:pPr>
+            <w:r/>
+            <w:r>
+              <w:rPr>
+                <w:b w:val="0"/>
+                <w:sz w:val="18"/>
+              </w:rPr>
+              <w:t>Entier</w:t>
+            </w:r>
+          </w:p>
+        </w:tc>
+        <w:tc>
+          <w:tcPr>
+            <w:tcW w:type="dxa" w:w="4896"/>
+          </w:tcPr>
+          <w:p>
+            <w:pPr>
+              <w:spacing w:after="20" w:before="20"/>
+            </w:pPr>
+            <w:r/>
+            <w:r>
+              <w:rPr>
+                <w:b w:val="0"/>
+                <w:sz w:val="18"/>
+              </w:rPr>
+              <w:t>Inscrits du mois</w:t>
+            </w:r>
+          </w:p>
+        </w:tc>
+        <w:tc>
+          <w:tcPr>
+            <w:tcW w:type="dxa" w:w="2160"/>
+          </w:tcPr>
+          <w:p>
+            <w:pPr>
+              <w:spacing w:after="20" w:before="20"/>
+            </w:pPr>
+            <w:r/>
+            <w:r>
+              <w:rPr>
+                <w:b w:val="0"/>
+                <w:sz w:val="18"/>
+              </w:rPr>
+              <w:t>104</w:t>
+            </w:r>
+          </w:p>
+        </w:tc>
+      </w:tr>
+      <w:tr>
+        <w:tc>
+          <w:tcPr>
+            <w:tcW w:type="dxa" w:w="2448"/>
+            <w:shd w:val="clear" w:color="auto" w:fill="EEF3F8"/>
+          </w:tcPr>
+          <w:p>
+            <w:pPr>
+              <w:spacing w:after="20" w:before="20"/>
+            </w:pPr>
+            <w:r/>
+            <w:r>
+              <w:rPr>
+                <w:b/>
+                <w:sz w:val="18"/>
+              </w:rPr>
+              <w:t>desabonnements</w:t>
+            </w:r>
+          </w:p>
+        </w:tc>
+        <w:tc>
+          <w:tcPr>
+            <w:tcW w:type="dxa" w:w="1296"/>
+            <w:shd w:val="clear" w:color="auto" w:fill="EEF3F8"/>
+          </w:tcPr>
+          <w:p>
+            <w:pPr>
+              <w:spacing w:after="20" w:before="20"/>
+            </w:pPr>
+            <w:r/>
+            <w:r>
+              <w:rPr>
+                <w:b w:val="0"/>
+                <w:sz w:val="18"/>
+              </w:rPr>
+              <w:t>Entier</w:t>
+            </w:r>
+          </w:p>
+        </w:tc>
+        <w:tc>
+          <w:tcPr>
+            <w:tcW w:type="dxa" w:w="4896"/>
+            <w:shd w:val="clear" w:color="auto" w:fill="EEF3F8"/>
+          </w:tcPr>
+          <w:p>
+            <w:pPr>
+              <w:spacing w:after="20" w:before="20"/>
+            </w:pPr>
+            <w:r/>
+            <w:r>
+              <w:rPr>
+                <w:b w:val="0"/>
+                <w:sz w:val="18"/>
+              </w:rPr>
+              <w:t>Désinscrits du mois</w:t>
+            </w:r>
+          </w:p>
+        </w:tc>
+        <w:tc>
+          <w:tcPr>
+            <w:tcW w:type="dxa" w:w="2160"/>
+            <w:shd w:val="clear" w:color="auto" w:fill="EEF3F8"/>
+          </w:tcPr>
+          <w:p>
+            <w:pPr>
+              <w:spacing w:after="20" w:before="20"/>
+            </w:pPr>
+            <w:r/>
+            <w:r>
+              <w:rPr>
+                <w:b w:val="0"/>
+                <w:sz w:val="18"/>
+              </w:rPr>
+              <w:t>41</w:t>
+            </w:r>
+          </w:p>
+        </w:tc>
+      </w:tr>
+      <w:tr>
+        <w:tc>
+          <w:tcPr>
+            <w:tcW w:type="dxa" w:w="2448"/>
+          </w:tcPr>
+          <w:p>
+            <w:pPr>
+              <w:spacing w:after="20" w:before="20"/>
+            </w:pPr>
+            <w:r/>
+            <w:r>
+              <w:rPr>
+                <w:b/>
+                <w:sz w:val="18"/>
+              </w:rPr>
+              <w:t>taux_ouverture</w:t>
+            </w:r>
+          </w:p>
+        </w:tc>
+        <w:tc>
+          <w:tcPr>
+            <w:tcW w:type="dxa" w:w="1296"/>
+          </w:tcPr>
+          <w:p>
+            <w:pPr>
+              <w:spacing w:after="20" w:before="20"/>
+            </w:pPr>
+            <w:r/>
+            <w:r>
+              <w:rPr>
+                <w:b w:val="0"/>
+                <w:sz w:val="18"/>
+              </w:rPr>
+              <w:t>Décimal</w:t>
+            </w:r>
+          </w:p>
+        </w:tc>
+        <w:tc>
+          <w:tcPr>
+            <w:tcW w:type="dxa" w:w="4896"/>
+          </w:tcPr>
+          <w:p>
+            <w:pPr>
+              <w:spacing w:after="20" w:before="20"/>
+            </w:pPr>
+            <w:r/>
+            <w:r>
+              <w:rPr>
+                <w:b w:val="0"/>
+                <w:sz w:val="18"/>
+              </w:rPr>
+              <w:t>Taux d'ouverture moyen</w:t>
+            </w:r>
+          </w:p>
+        </w:tc>
+        <w:tc>
+          <w:tcPr>
+            <w:tcW w:type="dxa" w:w="2160"/>
+          </w:tcPr>
+          <w:p>
+            <w:pPr>
+              <w:spacing w:after="20" w:before="20"/>
+            </w:pPr>
+            <w:r/>
+            <w:r>
+              <w:rPr>
+                <w:b w:val="0"/>
+                <w:sz w:val="18"/>
+              </w:rPr>
+              <w:t>0.34</w:t>
+            </w:r>
+          </w:p>
+        </w:tc>
+      </w:tr>
+      <w:tr>
+        <w:tc>
+          <w:tcPr>
+            <w:tcW w:type="dxa" w:w="2448"/>
+            <w:shd w:val="clear" w:color="auto" w:fill="EEF3F8"/>
+          </w:tcPr>
+          <w:p>
+            <w:pPr>
+              <w:spacing w:after="20" w:before="20"/>
+            </w:pPr>
+            <w:r/>
+            <w:r>
+              <w:rPr>
+                <w:b/>
+                <w:sz w:val="18"/>
+              </w:rPr>
+              <w:t>taux_clic_email</w:t>
+            </w:r>
+          </w:p>
+        </w:tc>
+        <w:tc>
+          <w:tcPr>
+            <w:tcW w:type="dxa" w:w="1296"/>
+            <w:shd w:val="clear" w:color="auto" w:fill="EEF3F8"/>
+          </w:tcPr>
+          <w:p>
+            <w:pPr>
+              <w:spacing w:after="20" w:before="20"/>
+            </w:pPr>
+            <w:r/>
+            <w:r>
+              <w:rPr>
+                <w:b w:val="0"/>
+                <w:sz w:val="18"/>
+              </w:rPr>
+              <w:t>Décimal</w:t>
+            </w:r>
+          </w:p>
+        </w:tc>
+        <w:tc>
+          <w:tcPr>
+            <w:tcW w:type="dxa" w:w="4896"/>
+            <w:shd w:val="clear" w:color="auto" w:fill="EEF3F8"/>
+          </w:tcPr>
+          <w:p>
+            <w:pPr>
+              <w:spacing w:after="20" w:before="20"/>
+            </w:pPr>
+            <w:r/>
+            <w:r>
+              <w:rPr>
+                <w:b w:val="0"/>
+                <w:sz w:val="18"/>
+              </w:rPr>
+              <w:t>Taux de clic email</w:t>
+            </w:r>
+          </w:p>
+        </w:tc>
+        <w:tc>
+          <w:tcPr>
+            <w:tcW w:type="dxa" w:w="2160"/>
+            <w:shd w:val="clear" w:color="auto" w:fill="EEF3F8"/>
+          </w:tcPr>
+          <w:p>
+            <w:pPr>
+              <w:spacing w:after="20" w:before="20"/>
+            </w:pPr>
+            <w:r/>
+            <w:r>
+              <w:rPr>
+                <w:b w:val="0"/>
+                <w:sz w:val="18"/>
+              </w:rPr>
+              <w:t>0.04</w:t>
+            </w:r>
+          </w:p>
+        </w:tc>
+      </w:tr>
+    </w:tbl>
+    <w:p>
+      <w:pPr>
+        <w:spacing w:after="80"/>
+      </w:pPr>
+    </w:p>
+    <w:p>
+      <w:pPr>
         <w:spacing w:before="280" w:after="120"/>
         <w:pBdr>
           <w:bottom w:val="single" w:sz="8" w:space="3" w:color="E86A17"/>
@@ -8573,6 +10293,351 @@
           </w:p>
         </w:tc>
       </w:tr>
+      <w:tr>
+        <w:tc>
+          <w:tcPr>
+            <w:tcW w:type="dxa" w:w="4320"/>
+          </w:tcPr>
+          <w:p>
+            <w:pPr>
+              <w:spacing w:after="20" w:before="20"/>
+            </w:pPr>
+            <w:r/>
+            <w:r>
+              <w:rPr>
+                <w:b/>
+                <w:sz w:val="18"/>
+              </w:rPr>
+              <w:t>CTR (Click-Through Rate — Taux de clic)</w:t>
+            </w:r>
+          </w:p>
+        </w:tc>
+        <w:tc>
+          <w:tcPr>
+            <w:tcW w:type="dxa" w:w="4320"/>
+          </w:tcPr>
+          <w:p>
+            <w:pPr>
+              <w:spacing w:after="20" w:before="20"/>
+            </w:pPr>
+            <w:r/>
+            <w:r>
+              <w:rPr>
+                <w:b w:val="0"/>
+                <w:sz w:val="18"/>
+              </w:rPr>
+              <w:t>clics / impressions</w:t>
+            </w:r>
+          </w:p>
+        </w:tc>
+        <w:tc>
+          <w:tcPr>
+            <w:tcW w:type="dxa" w:w="1152"/>
+          </w:tcPr>
+          <w:p>
+            <w:pPr>
+              <w:spacing w:after="20" w:before="20"/>
+            </w:pPr>
+            <w:r/>
+            <w:r>
+              <w:rPr>
+                <w:b w:val="0"/>
+                <w:sz w:val="18"/>
+              </w:rPr>
+              <w:t>%</w:t>
+            </w:r>
+          </w:p>
+        </w:tc>
+      </w:tr>
+      <w:tr>
+        <w:tc>
+          <w:tcPr>
+            <w:tcW w:type="dxa" w:w="4320"/>
+            <w:shd w:val="clear" w:color="auto" w:fill="EEF3F8"/>
+          </w:tcPr>
+          <w:p>
+            <w:pPr>
+              <w:spacing w:after="20" w:before="20"/>
+            </w:pPr>
+            <w:r/>
+            <w:r>
+              <w:rPr>
+                <w:b/>
+                <w:sz w:val="18"/>
+              </w:rPr>
+              <w:t>CPC (Cost Per Click — Coût Par Clic)</w:t>
+            </w:r>
+          </w:p>
+        </w:tc>
+        <w:tc>
+          <w:tcPr>
+            <w:tcW w:type="dxa" w:w="4320"/>
+            <w:shd w:val="clear" w:color="auto" w:fill="EEF3F8"/>
+          </w:tcPr>
+          <w:p>
+            <w:pPr>
+              <w:spacing w:after="20" w:before="20"/>
+            </w:pPr>
+            <w:r/>
+            <w:r>
+              <w:rPr>
+                <w:b w:val="0"/>
+                <w:sz w:val="18"/>
+              </w:rPr>
+              <w:t>dépense / clics</w:t>
+            </w:r>
+          </w:p>
+        </w:tc>
+        <w:tc>
+          <w:tcPr>
+            <w:tcW w:type="dxa" w:w="1152"/>
+            <w:shd w:val="clear" w:color="auto" w:fill="EEF3F8"/>
+          </w:tcPr>
+          <w:p>
+            <w:pPr>
+              <w:spacing w:after="20" w:before="20"/>
+            </w:pPr>
+            <w:r/>
+            <w:r>
+              <w:rPr>
+                <w:b w:val="0"/>
+                <w:sz w:val="18"/>
+              </w:rPr>
+              <w:t>€</w:t>
+            </w:r>
+          </w:p>
+        </w:tc>
+      </w:tr>
+      <w:tr>
+        <w:tc>
+          <w:tcPr>
+            <w:tcW w:type="dxa" w:w="4320"/>
+          </w:tcPr>
+          <w:p>
+            <w:pPr>
+              <w:spacing w:after="20" w:before="20"/>
+            </w:pPr>
+            <w:r/>
+            <w:r>
+              <w:rPr>
+                <w:b/>
+                <w:sz w:val="18"/>
+              </w:rPr>
+              <w:t>Taux de rebond</w:t>
+            </w:r>
+          </w:p>
+        </w:tc>
+        <w:tc>
+          <w:tcPr>
+            <w:tcW w:type="dxa" w:w="4320"/>
+          </w:tcPr>
+          <w:p>
+            <w:pPr>
+              <w:spacing w:after="20" w:before="20"/>
+            </w:pPr>
+            <w:r/>
+            <w:r>
+              <w:rPr>
+                <w:b w:val="0"/>
+                <w:sz w:val="18"/>
+              </w:rPr>
+              <w:t>sessions sans interaction / sessions</w:t>
+            </w:r>
+          </w:p>
+        </w:tc>
+        <w:tc>
+          <w:tcPr>
+            <w:tcW w:type="dxa" w:w="1152"/>
+          </w:tcPr>
+          <w:p>
+            <w:pPr>
+              <w:spacing w:after="20" w:before="20"/>
+            </w:pPr>
+            <w:r/>
+            <w:r>
+              <w:rPr>
+                <w:b w:val="0"/>
+                <w:sz w:val="18"/>
+              </w:rPr>
+              <w:t>%</w:t>
+            </w:r>
+          </w:p>
+        </w:tc>
+      </w:tr>
+      <w:tr>
+        <w:tc>
+          <w:tcPr>
+            <w:tcW w:type="dxa" w:w="4320"/>
+            <w:shd w:val="clear" w:color="auto" w:fill="EEF3F8"/>
+          </w:tcPr>
+          <w:p>
+            <w:pPr>
+              <w:spacing w:after="20" w:before="20"/>
+            </w:pPr>
+            <w:r/>
+            <w:r>
+              <w:rPr>
+                <w:b/>
+                <w:sz w:val="18"/>
+              </w:rPr>
+              <w:t>ROAS (Return On Ad Spend — Retour sur Dépense Pub)</w:t>
+            </w:r>
+          </w:p>
+        </w:tc>
+        <w:tc>
+          <w:tcPr>
+            <w:tcW w:type="dxa" w:w="4320"/>
+            <w:shd w:val="clear" w:color="auto" w:fill="EEF3F8"/>
+          </w:tcPr>
+          <w:p>
+            <w:pPr>
+              <w:spacing w:after="20" w:before="20"/>
+            </w:pPr>
+            <w:r/>
+            <w:r>
+              <w:rPr>
+                <w:b w:val="0"/>
+                <w:sz w:val="18"/>
+              </w:rPr>
+              <w:t>MRR généré / dépense pub</w:t>
+            </w:r>
+          </w:p>
+        </w:tc>
+        <w:tc>
+          <w:tcPr>
+            <w:tcW w:type="dxa" w:w="1152"/>
+            <w:shd w:val="clear" w:color="auto" w:fill="EEF3F8"/>
+          </w:tcPr>
+          <w:p>
+            <w:pPr>
+              <w:spacing w:after="20" w:before="20"/>
+            </w:pPr>
+            <w:r/>
+            <w:r>
+              <w:rPr>
+                <w:b w:val="0"/>
+                <w:sz w:val="18"/>
+              </w:rPr>
+              <w:t>ratio</w:t>
+            </w:r>
+          </w:p>
+        </w:tc>
+      </w:tr>
+      <w:tr>
+        <w:tc>
+          <w:tcPr>
+            <w:tcW w:type="dxa" w:w="4320"/>
+          </w:tcPr>
+          <w:p>
+            <w:pPr>
+              <w:spacing w:after="20" w:before="20"/>
+            </w:pPr>
+            <w:r/>
+            <w:r>
+              <w:rPr>
+                <w:b/>
+                <w:sz w:val="18"/>
+              </w:rPr>
+              <w:t>Taux d'ouverture / clic newsletter</w:t>
+            </w:r>
+          </w:p>
+        </w:tc>
+        <w:tc>
+          <w:tcPr>
+            <w:tcW w:type="dxa" w:w="4320"/>
+          </w:tcPr>
+          <w:p>
+            <w:pPr>
+              <w:spacing w:after="20" w:before="20"/>
+            </w:pPr>
+            <w:r/>
+            <w:r>
+              <w:rPr>
+                <w:b w:val="0"/>
+                <w:sz w:val="18"/>
+              </w:rPr>
+              <w:t>ouvertures (clics) / emails envoyés</w:t>
+            </w:r>
+          </w:p>
+        </w:tc>
+        <w:tc>
+          <w:tcPr>
+            <w:tcW w:type="dxa" w:w="1152"/>
+          </w:tcPr>
+          <w:p>
+            <w:pPr>
+              <w:spacing w:after="20" w:before="20"/>
+            </w:pPr>
+            <w:r/>
+            <w:r>
+              <w:rPr>
+                <w:b w:val="0"/>
+                <w:sz w:val="18"/>
+              </w:rPr>
+              <w:t>%</w:t>
+            </w:r>
+          </w:p>
+        </w:tc>
+      </w:tr>
+      <w:tr>
+        <w:tc>
+          <w:tcPr>
+            <w:tcW w:type="dxa" w:w="4320"/>
+            <w:shd w:val="clear" w:color="auto" w:fill="EEF3F8"/>
+          </w:tcPr>
+          <w:p>
+            <w:pPr>
+              <w:spacing w:after="20" w:before="20"/>
+            </w:pPr>
+            <w:r/>
+            <w:r>
+              <w:rPr>
+                <w:b/>
+                <w:sz w:val="18"/>
+              </w:rPr>
+              <w:t>Croissance abonnés newsletter</w:t>
+            </w:r>
+          </w:p>
+        </w:tc>
+        <w:tc>
+          <w:tcPr>
+            <w:tcW w:type="dxa" w:w="4320"/>
+            <w:shd w:val="clear" w:color="auto" w:fill="EEF3F8"/>
+          </w:tcPr>
+          <w:p>
+            <w:pPr>
+              <w:spacing w:after="20" w:before="20"/>
+            </w:pPr>
+            <w:r/>
+            <w:r>
+              <w:rPr>
+                <w:b w:val="0"/>
+                <w:sz w:val="18"/>
+              </w:rPr>
+              <w:t>nouveaux_abonnes − desabonnements</w:t>
+            </w:r>
+          </w:p>
+        </w:tc>
+        <w:tc>
+          <w:tcPr>
+            <w:tcW w:type="dxa" w:w="1152"/>
+            <w:shd w:val="clear" w:color="auto" w:fill="EEF3F8"/>
+          </w:tcPr>
+          <w:p>
+            <w:pPr>
+              <w:spacing w:after="20" w:before="20"/>
+            </w:pPr>
+            <w:r/>
+            <w:r>
+              <w:rPr>
+                <w:b w:val="0"/>
+                <w:sz w:val="18"/>
+              </w:rPr>
+              <w:t>abonnés</w:t>
+            </w:r>
+          </w:p>
+        </w:tc>
+      </w:tr>
     </w:tbl>
     <w:p>
       <w:pPr>
@@ -9696,7 +11761,63 @@
                 <w:b w:val="0"/>
                 <w:sz w:val="18"/>
               </w:rPr>
-              <w:t>Connecteur reporting (ROI)</w:t>
+              <w:t>Connecteur reporting (ROI) → fact_acquisition</w:t>
+            </w:r>
+          </w:p>
+        </w:tc>
+      </w:tr>
+      <w:tr>
+        <w:tc>
+          <w:tcPr>
+            <w:tcW w:type="dxa" w:w="2880"/>
+          </w:tcPr>
+          <w:p>
+            <w:pPr>
+              <w:spacing w:after="20" w:before="20"/>
+            </w:pPr>
+            <w:r/>
+            <w:r>
+              <w:rPr>
+                <w:b/>
+                <w:sz w:val="18"/>
+              </w:rPr>
+              <w:t>Web analytics &amp; newsletter</w:t>
+            </w:r>
+          </w:p>
+        </w:tc>
+        <w:tc>
+          <w:tcPr>
+            <w:tcW w:type="dxa" w:w="3456"/>
+          </w:tcPr>
+          <w:p>
+            <w:pPr>
+              <w:spacing w:after="20" w:before="20"/>
+            </w:pPr>
+            <w:r/>
+            <w:r>
+              <w:rPr>
+                <w:b w:val="0"/>
+                <w:sz w:val="18"/>
+              </w:rPr>
+              <w:t>Google Analytics / outil d'emailing</w:t>
+            </w:r>
+          </w:p>
+        </w:tc>
+        <w:tc>
+          <w:tcPr>
+            <w:tcW w:type="dxa" w:w="3456"/>
+          </w:tcPr>
+          <w:p>
+            <w:pPr>
+              <w:spacing w:after="20" w:before="20"/>
+            </w:pPr>
+            <w:r/>
+            <w:r>
+              <w:rPr>
+                <w:b w:val="0"/>
+                <w:sz w:val="18"/>
+              </w:rPr>
+              <w:t>fact_acquisition + fact_newsletter (reliés par canal + date)</w:t>
             </w:r>
           </w:p>
         </w:tc>
@@ -10177,6 +12298,236 @@
                 <w:sz w:val="18"/>
               </w:rPr>
               <w:t>Coût Par Lead : dépense pour générer un prospect.</w:t>
+            </w:r>
+          </w:p>
+        </w:tc>
+      </w:tr>
+      <w:tr>
+        <w:tc>
+          <w:tcPr>
+            <w:tcW w:type="dxa" w:w="1440"/>
+            <w:shd w:val="clear" w:color="auto" w:fill="EEF3F8"/>
+          </w:tcPr>
+          <w:p>
+            <w:pPr>
+              <w:spacing w:after="20" w:before="20"/>
+            </w:pPr>
+            <w:r/>
+            <w:r>
+              <w:rPr>
+                <w:b/>
+                <w:sz w:val="18"/>
+              </w:rPr>
+              <w:t>CTR</w:t>
+            </w:r>
+          </w:p>
+        </w:tc>
+        <w:tc>
+          <w:tcPr>
+            <w:tcW w:type="dxa" w:w="3312"/>
+            <w:shd w:val="clear" w:color="auto" w:fill="EEF3F8"/>
+          </w:tcPr>
+          <w:p>
+            <w:pPr>
+              <w:spacing w:after="20" w:before="20"/>
+            </w:pPr>
+            <w:r/>
+            <w:r>
+              <w:rPr>
+                <w:b w:val="0"/>
+                <w:sz w:val="18"/>
+              </w:rPr>
+              <w:t>Click-Through Rate</w:t>
+            </w:r>
+          </w:p>
+        </w:tc>
+        <w:tc>
+          <w:tcPr>
+            <w:tcW w:type="dxa" w:w="5040"/>
+            <w:shd w:val="clear" w:color="auto" w:fill="EEF3F8"/>
+          </w:tcPr>
+          <w:p>
+            <w:pPr>
+              <w:spacing w:after="20" w:before="20"/>
+            </w:pPr>
+            <w:r/>
+            <w:r>
+              <w:rPr>
+                <w:b w:val="0"/>
+                <w:sz w:val="18"/>
+              </w:rPr>
+              <w:t>Taux de clic = clics / impressions.</w:t>
+            </w:r>
+          </w:p>
+        </w:tc>
+      </w:tr>
+      <w:tr>
+        <w:tc>
+          <w:tcPr>
+            <w:tcW w:type="dxa" w:w="1440"/>
+          </w:tcPr>
+          <w:p>
+            <w:pPr>
+              <w:spacing w:after="20" w:before="20"/>
+            </w:pPr>
+            <w:r/>
+            <w:r>
+              <w:rPr>
+                <w:b/>
+                <w:sz w:val="18"/>
+              </w:rPr>
+              <w:t>CPC</w:t>
+            </w:r>
+          </w:p>
+        </w:tc>
+        <w:tc>
+          <w:tcPr>
+            <w:tcW w:type="dxa" w:w="3312"/>
+          </w:tcPr>
+          <w:p>
+            <w:pPr>
+              <w:spacing w:after="20" w:before="20"/>
+            </w:pPr>
+            <w:r/>
+            <w:r>
+              <w:rPr>
+                <w:b w:val="0"/>
+                <w:sz w:val="18"/>
+              </w:rPr>
+              <w:t>Cost Per Click</w:t>
+            </w:r>
+          </w:p>
+        </w:tc>
+        <w:tc>
+          <w:tcPr>
+            <w:tcW w:type="dxa" w:w="5040"/>
+          </w:tcPr>
+          <w:p>
+            <w:pPr>
+              <w:spacing w:after="20" w:before="20"/>
+            </w:pPr>
+            <w:r/>
+            <w:r>
+              <w:rPr>
+                <w:b w:val="0"/>
+                <w:sz w:val="18"/>
+              </w:rPr>
+              <w:t>Coût par clic publicitaire.</w:t>
+            </w:r>
+          </w:p>
+        </w:tc>
+      </w:tr>
+      <w:tr>
+        <w:tc>
+          <w:tcPr>
+            <w:tcW w:type="dxa" w:w="1440"/>
+            <w:shd w:val="clear" w:color="auto" w:fill="EEF3F8"/>
+          </w:tcPr>
+          <w:p>
+            <w:pPr>
+              <w:spacing w:after="20" w:before="20"/>
+            </w:pPr>
+            <w:r/>
+            <w:r>
+              <w:rPr>
+                <w:b/>
+                <w:sz w:val="18"/>
+              </w:rPr>
+              <w:t>ROAS</w:t>
+            </w:r>
+          </w:p>
+        </w:tc>
+        <w:tc>
+          <w:tcPr>
+            <w:tcW w:type="dxa" w:w="3312"/>
+            <w:shd w:val="clear" w:color="auto" w:fill="EEF3F8"/>
+          </w:tcPr>
+          <w:p>
+            <w:pPr>
+              <w:spacing w:after="20" w:before="20"/>
+            </w:pPr>
+            <w:r/>
+            <w:r>
+              <w:rPr>
+                <w:b w:val="0"/>
+                <w:sz w:val="18"/>
+              </w:rPr>
+              <w:t>Return On Ad Spend</w:t>
+            </w:r>
+          </w:p>
+        </w:tc>
+        <w:tc>
+          <w:tcPr>
+            <w:tcW w:type="dxa" w:w="5040"/>
+            <w:shd w:val="clear" w:color="auto" w:fill="EEF3F8"/>
+          </w:tcPr>
+          <w:p>
+            <w:pPr>
+              <w:spacing w:after="20" w:before="20"/>
+            </w:pPr>
+            <w:r/>
+            <w:r>
+              <w:rPr>
+                <w:b w:val="0"/>
+                <w:sz w:val="18"/>
+              </w:rPr>
+              <w:t>Retour sur dépense publicitaire = revenu / dépense pub.</w:t>
+            </w:r>
+          </w:p>
+        </w:tc>
+      </w:tr>
+      <w:tr>
+        <w:tc>
+          <w:tcPr>
+            <w:tcW w:type="dxa" w:w="1440"/>
+          </w:tcPr>
+          <w:p>
+            <w:pPr>
+              <w:spacing w:after="20" w:before="20"/>
+            </w:pPr>
+            <w:r/>
+            <w:r>
+              <w:rPr>
+                <w:b/>
+                <w:sz w:val="18"/>
+              </w:rPr>
+              <w:t>GA</w:t>
+            </w:r>
+          </w:p>
+        </w:tc>
+        <w:tc>
+          <w:tcPr>
+            <w:tcW w:type="dxa" w:w="3312"/>
+          </w:tcPr>
+          <w:p>
+            <w:pPr>
+              <w:spacing w:after="20" w:before="20"/>
+            </w:pPr>
+            <w:r/>
+            <w:r>
+              <w:rPr>
+                <w:b w:val="0"/>
+                <w:sz w:val="18"/>
+              </w:rPr>
+              <w:t>Google Analytics</w:t>
+            </w:r>
+          </w:p>
+        </w:tc>
+        <w:tc>
+          <w:tcPr>
+            <w:tcW w:type="dxa" w:w="5040"/>
+          </w:tcPr>
+          <w:p>
+            <w:pPr>
+              <w:spacing w:after="20" w:before="20"/>
+            </w:pPr>
+            <w:r/>
+            <w:r>
+              <w:rPr>
+                <w:b w:val="0"/>
+                <w:sz w:val="18"/>
+              </w:rPr>
+              <w:t>Outil de mesure d'audience du site web.</w:t>
             </w:r>
           </w:p>
         </w:tc>

</xml_diff>